<commit_message>
Portal: eskalace alertu 2 h, novy export SD, popis s citacemi ESH, aktualizace tabulky ukolu
</commit_message>
<xml_diff>
--- a/Vzkazy.docx
+++ b/Vzkazy.docx
@@ -186,6 +186,48 @@
       </w:r>
     </w:p>
     <w:p/>
+    <w:p>
+      <w:r>
+        <w:rPr>
+          <w:b/>
+          <w:bCs/>
+        </w:rPr>
+        <w:t xml:space="preserve">Od Sabi (29. 10.) – pro Emu (role 3):</w:t>
+      </w:r>
+    </w:p>
+    <w:p>
+      <w:pPr>
+        <w:numPr>
+          <w:ilvl w:val="0"/>
+          <w:numId w:val="1"/>
+        </w:numPr>
+      </w:pPr>
+      <w:r>
+        <w:t xml:space="preserve">Eskalace urgentního alertu: když ho lékař v ordinační době do 2 hodin nepřevezme, předá se zástupci lékaře; mimo ordinační dobu ihned. Dobu 2 h nastavuje administrátor.</w:t>
+      </w:r>
+    </w:p>
+    <w:p>
+      <w:pPr>
+        <w:numPr>
+          <w:ilvl w:val="0"/>
+          <w:numId w:val="1"/>
+        </w:numPr>
+      </w:pPr>
+      <w:r>
+        <w:t xml:space="preserve">Prosím doplnit do ER v2: kdo je zástupce lékaře (např. sloupec Lekar.zastupce_lekar_id) a systémové nastavení doby eskalace (např. tabulka NastaveniSystemu: klic, hodnota).</w:t>
+      </w:r>
+    </w:p>
+    <w:p>
+      <w:pPr>
+        <w:numPr>
+          <w:ilvl w:val="0"/>
+          <w:numId w:val="1"/>
+        </w:numPr>
+      </w:pPr>
+      <w:r>
+        <w:t xml:space="preserve">Hodnoty sloupce Alert.stav podle mého stavového diagramu: Vytvořen, Odeslán lékaři, Zobrazen, Řeší se, Vyřešen, Eskalován, Zrušen.</w:t>
+      </w:r>
+    </w:p>
     <w:sectPr>
       <w:pgSz w:w="11906" w:h="16838"/>
       <w:pgMar w:top="1417" w:right="1417" w:bottom="1417" w:left="1417" w:header="708" w:footer="708" w:gutter="0"/>

</xml_diff>

<commit_message>
Vzkazy: pripominky z kontroly repozitare pro vsechny role
</commit_message>
<xml_diff>
--- a/Vzkazy.docx
+++ b/Vzkazy.docx
@@ -226,6 +226,238 @@
       </w:pPr>
       <w:r>
         <w:t xml:space="preserve">Hodnoty sloupce Alert.stav podle mého stavového diagramu: Vytvořen, Odeslán lékaři, Zobrazen, Řeší se, Vyřešen, Eskalován, Zrušen.</w:t>
+      </w:r>
+    </w:p>
+    <w:p>
+      <w:r>
+        <w:rPr>
+          <w:b/>
+          <w:bCs/>
+        </w:rPr>
+        <w:t xml:space="preserve">Od Sabi (29. 10.) – připomínky z kontroly repozitáře</w:t>
+      </w:r>
+    </w:p>
+    <w:p>
+      <w:r>
+        <w:rPr>
+          <w:b/>
+          <w:bCs/>
+        </w:rPr>
+        <w:t xml:space="preserve">Pro Maky (role 1):</w:t>
+      </w:r>
+    </w:p>
+    <w:p>
+      <w:pPr>
+        <w:numPr>
+          <w:ilvl w:val="0"/>
+          <w:numId w:val="1"/>
+        </w:numPr>
+      </w:pPr>
+      <w:r>
+        <w:t xml:space="preserve">Use case diagram: Tlakoměr i WEB API mají v draw.io jen 2 use casy – zadání chce min. 4 na aktéra (v .mmd jich tlakoměr má 4, stačí sjednotit). Aktéry nakreslit jako UML panáčky, ne obdélníky; šipky do „Synchronizovat data“ označit «include».</w:t>
+      </w:r>
+    </w:p>
+    <w:p>
+      <w:pPr>
+        <w:numPr>
+          <w:ilvl w:val="0"/>
+          <w:numId w:val="1"/>
+        </w:numPr>
+      </w:pPr>
+      <w:r>
+        <w:t xml:space="preserve">Doplnit use case i obrazovku „Číst doporučení lékaře“ (počítá s nimi portál i API), dále průvodce měřením a připomínky měření.</w:t>
+      </w:r>
+    </w:p>
+    <w:p>
+      <w:pPr>
+        <w:numPr>
+          <w:ilvl w:val="0"/>
+          <w:numId w:val="1"/>
+        </w:numPr>
+      </w:pPr>
+      <w:r>
+        <w:t xml:space="preserve">Stavové diagramy: doplnit počáteční stav (černé kolečko) a krátký odstavec popisu; u měření doplnit stav konfliktu 409 podle API Emy.</w:t>
+      </w:r>
+    </w:p>
+    <w:p>
+      <w:pPr>
+        <w:numPr>
+          <w:ilvl w:val="0"/>
+          <w:numId w:val="1"/>
+        </w:numPr>
+      </w:pPr>
+      <w:r>
+        <w:t xml:space="preserve">Děláme jen dokumentaci – z textů odstranit MVP, simulaci a funkční prototyp, psát „aplikace bude…“.</w:t>
+      </w:r>
+    </w:p>
+    <w:p>
+      <w:pPr>
+        <w:numPr>
+          <w:ilvl w:val="0"/>
+          <w:numId w:val="1"/>
+        </w:numPr>
+      </w:pPr>
+      <w:r>
+        <w:t xml:space="preserve">Do JSON s měřením přidat ID zařízení a příznak nepravidelného rytmu.</w:t>
+      </w:r>
+    </w:p>
+    <w:p>
+      <w:pPr>
+        <w:numPr>
+          <w:ilvl w:val="0"/>
+          <w:numId w:val="1"/>
+        </w:numPr>
+      </w:pPr>
+      <w:r>
+        <w:t xml:space="preserve">Sjednotit prefix požadavků (M-F vs. FP-A).</w:t>
+      </w:r>
+    </w:p>
+    <w:p>
+      <w:r>
+        <w:rPr>
+          <w:b/>
+          <w:bCs/>
+        </w:rPr>
+        <w:t xml:space="preserve">Pro Emu (role 3):</w:t>
+      </w:r>
+    </w:p>
+    <w:p>
+      <w:pPr>
+        <w:numPr>
+          <w:ilvl w:val="0"/>
+          <w:numId w:val="1"/>
+        </w:numPr>
+      </w:pPr>
+      <w:r>
+        <w:t xml:space="preserve">ER v2: LimitAlertu – urgentní limit (urgentni_sys, urgentni_dia) a dny bez měření; Alert – kdy a s jakou poznámkou byl vyřešen (vyreseno_at, poznamka); klientské UUID pro Aktivita a ZaznamZivotospravy; datové typy sloupců; krátký popis každé tabulky.</w:t>
+      </w:r>
+    </w:p>
+    <w:p>
+      <w:pPr>
+        <w:numPr>
+          <w:ilvl w:val="0"/>
+          <w:numId w:val="1"/>
+        </w:numPr>
+      </w:pPr>
+      <w:r>
+        <w:t xml:space="preserve">Oprávnění k alertům: v API je pacient smí číst, v matici portálu ne. Návrh: pacient alerty nevidí, aplikace mu jen zobrazí výzvu ke kontaktu s lékařem.</w:t>
+      </w:r>
+    </w:p>
+    <w:p>
+      <w:pPr>
+        <w:numPr>
+          <w:ilvl w:val="0"/>
+          <w:numId w:val="1"/>
+        </w:numPr>
+      </w:pPr>
+      <w:r>
+        <w:t xml:space="preserve">Záznamy měření se nemažou, jen opravují (s historií změn) – ať to sedí s popisem portálu.</w:t>
+      </w:r>
+    </w:p>
+    <w:p>
+      <w:pPr>
+        <w:numPr>
+          <w:ilvl w:val="0"/>
+          <w:numId w:val="1"/>
+        </w:numPr>
+      </w:pPr>
+      <w:r>
+        <w:t xml:space="preserve">Do Implementace doplnit technologii portálu: React + TypeScript (SPA).</w:t>
+      </w:r>
+    </w:p>
+    <w:p>
+      <w:pPr>
+        <w:numPr>
+          <w:ilvl w:val="0"/>
+          <w:numId w:val="1"/>
+        </w:numPr>
+      </w:pPr>
+      <w:r>
+        <w:t xml:space="preserve">Popis Gitu (větve + Pull Requesty) neodpovídá praxi – buď to začít používat, nebo text upravit.</w:t>
+      </w:r>
+    </w:p>
+    <w:p>
+      <w:pPr>
+        <w:numPr>
+          <w:ilvl w:val="0"/>
+          <w:numId w:val="1"/>
+        </w:numPr>
+      </w:pPr>
+      <w:r>
+        <w:t xml:space="preserve">Stavový diagram API: doplnit počáteční stav. Otevřený bod 5 (prototyp) smazat – děláme jen dokumentaci.</w:t>
+      </w:r>
+    </w:p>
+    <w:p>
+      <w:r>
+        <w:rPr>
+          <w:b/>
+          <w:bCs/>
+        </w:rPr>
+        <w:t xml:space="preserve">Pro Domi (role 4):</w:t>
+      </w:r>
+    </w:p>
+    <w:p>
+      <w:pPr>
+        <w:numPr>
+          <w:ilvl w:val="0"/>
+          <w:numId w:val="1"/>
+        </w:numPr>
+      </w:pPr>
+      <w:r>
+        <w:t xml:space="preserve">Prosím ozvi se do dnešní půlnoci (29. 10.), jestli roli 4 děláš. Čeká na ni use case diagram integrátoru, stavový diagram synchronizace, FHIR mapování a Úvod (termín 18. 11.).</w:t>
+      </w:r>
+    </w:p>
+    <w:p>
+      <w:r>
+        <w:rPr>
+          <w:b/>
+          <w:bCs/>
+        </w:rPr>
+        <w:t xml:space="preserve">Všem:</w:t>
+      </w:r>
+    </w:p>
+    <w:p>
+      <w:pPr>
+        <w:numPr>
+          <w:ilvl w:val="0"/>
+          <w:numId w:val="1"/>
+        </w:numPr>
+      </w:pPr>
+      <w:r>
+        <w:t xml:space="preserve">Spojit požadavky do jedné tabulky – role 3 a 4 je zatím nemají.</w:t>
+      </w:r>
+    </w:p>
+    <w:p>
+      <w:pPr>
+        <w:numPr>
+          <w:ilvl w:val="0"/>
+          <w:numId w:val="1"/>
+        </w:numPr>
+      </w:pPr>
+      <w:r>
+        <w:t xml:space="preserve">Component diagram celého systému do 11. 11.; jako základ lze použít komponenty mobilu od Maky.</w:t>
+      </w:r>
+    </w:p>
+    <w:p>
+      <w:pPr>
+        <w:numPr>
+          <w:ilvl w:val="0"/>
+          <w:numId w:val="1"/>
+        </w:numPr>
+      </w:pPr>
+      <w:r>
+        <w:t xml:space="preserve">Psát popisné commit zprávy místo „Add files via upload“ – používání gitu se hodnotí.</w:t>
+      </w:r>
+    </w:p>
+    <w:p>
+      <w:pPr>
+        <w:numPr>
+          <w:ilvl w:val="0"/>
+          <w:numId w:val="1"/>
+        </w:numPr>
+      </w:pPr>
+      <w:r>
+        <w:t xml:space="preserve">Schůzka: role 4, prototyp vs. dokumentace, oprávnění k alertům, bezpečnost a GDPR.</w:t>
       </w:r>
     </w:p>
     <w:sectPr>

</xml_diff>

<commit_message>
Testovani: navrh kapitoly, vzkaz k odsouhlaseni scenaru
</commit_message>
<xml_diff>
--- a/Vzkazy.docx
+++ b/Vzkazy.docx
@@ -458,6 +458,26 @@
       </w:pPr>
       <w:r>
         <w:t xml:space="preserve">Schůzka: role 4, prototyp vs. dokumentace, oprávnění k alertům, bezpečnost a GDPR.</w:t>
+      </w:r>
+    </w:p>
+    <w:p>
+      <w:r>
+        <w:rPr>
+          <w:b/>
+          <w:bCs/>
+        </w:rPr>
+        <w:t xml:space="preserve">Od Sabi (29. 10.) – kapitola Testování (Sabi/17_Testovani.docx)</w:t>
+      </w:r>
+    </w:p>
+    <w:p>
+      <w:pPr>
+        <w:numPr>
+          <w:ilvl w:val="0"/>
+          <w:numId w:val="1"/>
+        </w:numPr>
+      </w:pPr>
+      <w:r>
+        <w:t xml:space="preserve">Testovací scénáře pro aplikaci (A-01 až A-03) a API (S-01 až S-04) jsem převzala od Maky a Emy, scénáře pro integrátor (I-01 až I-03) jsem navrhla sama, protože role 4 zatím nic nemá. Prosím odsouhlaste je – na schůzce na to stačí 5 minut.</w:t>
       </w:r>
     </w:p>
     <w:sectPr>

</xml_diff>

<commit_message>
Spolecne pozadavky: sloucena tabulka FP/NFP, vzkaz k odsouhlaseni
</commit_message>
<xml_diff>
--- a/Vzkazy.docx
+++ b/Vzkazy.docx
@@ -478,6 +478,103 @@
       </w:pPr>
       <w:r>
         <w:t xml:space="preserve">Testovací scénáře pro aplikaci (A-01 až A-03) a API (S-01 až S-04) jsem převzala od Maky a Emy, scénáře pro integrátor (I-01 až I-03) jsem navrhla sama, protože role 4 zatím nic nemá. Prosím odsouhlaste je – na schůzce na to stačí 5 minut.</w:t>
+      </w:r>
+    </w:p>
+    <w:p>
+      <w:r>
+        <w:rPr>
+          <w:b/>
+          <w:bCs/>
+        </w:rPr>
+        <w:t xml:space="preserve">Od Sabi (29. 10.) – společná tabulka požadavků (spolecny/Pozadavky_spolecne.xlsx)</w:t>
+      </w:r>
+    </w:p>
+    <w:p>
+      <w:pPr>
+        <w:numPr>
+          <w:ilvl w:val="0"/>
+          <w:numId w:val="1"/>
+        </w:numPr>
+      </w:pPr>
+      <w:r>
+        <w:t xml:space="preserve">Spojila jsem požadavky všech bloků do jedné tabulky: 46 funkčních (FP-A aplikace, FP-P portál, FP-S API, FP-I integrátor) a 17 nefunkčních (NFP), s prioritou MoSCoW a vazbou na use casy.</w:t>
+      </w:r>
+    </w:p>
+    <w:p>
+      <w:pPr>
+        <w:numPr>
+          <w:ilvl w:val="0"/>
+          <w:numId w:val="1"/>
+        </w:numPr>
+      </w:pPr>
+      <w:r>
+        <w:t xml:space="preserve">Šedé řádky jsou „Navrženo při spojení“ – doplnila jsem je, protože chyběly; vlastník bloku je potvrdí, upraví nebo zruší.</w:t>
+      </w:r>
+    </w:p>
+    <w:p>
+      <w:pPr>
+        <w:numPr>
+          <w:ilvl w:val="0"/>
+          <w:numId w:val="1"/>
+        </w:numPr>
+      </w:pPr>
+      <w:r>
+        <w:t xml:space="preserve">Maky: projdi FP-A01–A16. Tvoje M-F01–10 mají nová ID (původní ID je ve sloupci B). Šedé A11–A15 (doporučení lékaře, průvodce měřením, připomínky, výzva při vysoké hodnotě, nepravidelný rytmus) zatím chybí ve tvém use case diagramu – buď je doplň, nebo napiš, proč ne.</w:t>
+      </w:r>
+    </w:p>
+    <w:p>
+      <w:pPr>
+        <w:numPr>
+          <w:ilvl w:val="0"/>
+          <w:numId w:val="1"/>
+        </w:numPr>
+      </w:pPr>
+      <w:r>
+        <w:t xml:space="preserve">Ema: požadavky za API jsi zatím neměla, FP-S01–S08 jsem sestavila podle tvého popisu API – potvrď je nebo uprav; projdi i nefunkční NFP-03, 13, 15.</w:t>
+      </w:r>
+    </w:p>
+    <w:p>
+      <w:pPr>
+        <w:numPr>
+          <w:ilvl w:val="0"/>
+          <w:numId w:val="1"/>
+        </w:numPr>
+      </w:pPr>
+      <w:r>
+        <w:t xml:space="preserve">Role 4 (Domi, případně kdo ji převezme): projdi FP-I01–I09 a NFP-17.</w:t>
+      </w:r>
+    </w:p>
+    <w:p>
+      <w:pPr>
+        <w:numPr>
+          <w:ilvl w:val="0"/>
+          <w:numId w:val="1"/>
+        </w:numPr>
+      </w:pPr>
+      <w:r>
+        <w:t xml:space="preserve">Všichni: ve sloupci Stav nastavte Odsouhlaseno / Změnit / Zrušit a do Poznámky napište důvod. Prosím do neděle 1. 11.</w:t>
+      </w:r>
+    </w:p>
+    <w:p>
+      <w:pPr>
+        <w:numPr>
+          <w:ilvl w:val="0"/>
+          <w:numId w:val="1"/>
+        </w:numPr>
+      </w:pPr>
+      <w:r>
+        <w:t xml:space="preserve">Na schůzce pak společně: odsouhlasit priority MoSCoW, rozhodnout dobu uchování dat (NFP-16) a FP-I09 (posílat souhrn životosprávy do NIS?), vybrat persony (pacienti + lékař).</w:t>
+      </w:r>
+    </w:p>
+    <w:p>
+      <w:pPr>
+        <w:numPr>
+          <w:ilvl w:val="0"/>
+          <w:numId w:val="1"/>
+        </w:numPr>
+      </w:pPr>
+      <w:r>
+        <w:t xml:space="preserve">Potom (Sabi): z odsouhlasené tabulky napíšu kapitolu Analýza požadavků – úvodní text, cílová skupina, persony a tabulka.</w:t>
       </w:r>
     </w:p>
     <w:sectPr>

</xml_diff>

<commit_message>
Portal: navrh GUI (7 obrazovek), pripominky k navrhu aplikace
</commit_message>
<xml_diff>
--- a/Vzkazy.docx
+++ b/Vzkazy.docx
@@ -575,6 +575,92 @@
       </w:pPr>
       <w:r>
         <w:t xml:space="preserve">Potom (Sabi): z odsouhlasené tabulky napíšu kapitolu Analýza požadavků – úvodní text, cílová skupina, persony a tabulka.</w:t>
+      </w:r>
+    </w:p>
+    <w:p>
+      <w:r>
+        <w:rPr>
+          <w:b/>
+          <w:bCs/>
+        </w:rPr>
+        <w:t xml:space="preserve">Od Sabi (29. 10.) – návrh GUI portálu a připomínky k návrhu aplikace</w:t>
+      </w:r>
+    </w:p>
+    <w:p>
+      <w:pPr>
+        <w:numPr>
+          <w:ilvl w:val="0"/>
+          <w:numId w:val="1"/>
+        </w:numPr>
+      </w:pPr>
+      <w:r>
+        <w:t xml:space="preserve">Návrh GUI portálu je hotový: 7 obrazovek v Sabi/GUI_portal, popis do dokumentace v Sabi/16_GUI_portal.docx. Použila jsem stejné barvy a styl jako Maky (#1E6FD9, #60A5FA, #F3F8FF, bílé karty, zelená/oranžová/červená pro stavy) – prosím mrkněte, jestli to sedí.</w:t>
+      </w:r>
+    </w:p>
+    <w:p>
+      <w:pPr>
+        <w:numPr>
+          <w:ilvl w:val="0"/>
+          <w:numId w:val="1"/>
+        </w:numPr>
+      </w:pPr>
+      <w:r>
+        <w:t xml:space="preserve">Pro Maky: Barevné indikátory hodnot jsou v aplikaci pevné (&lt; 120/80 zelená, ≥ 140/90 červená) – to jsou hranice pro měření v ordinaci. Pro domácí měření je podle ESH 2023 hranice 135/85 a v systému máme individuální limity od lékaře. Portál barví podle limitů pacienta (zelená = v cíli, oranžová = nad horním limitem, červená = nad urgentním limitem, výchozí ≥ 180/110) – navrhuji, aby aplikace dělala totéž.</w:t>
+      </w:r>
+    </w:p>
+    <w:p>
+      <w:pPr>
+        <w:numPr>
+          <w:ilvl w:val="0"/>
+          <w:numId w:val="1"/>
+        </w:numPr>
+      </w:pPr>
+      <w:r>
+        <w:t xml:space="preserve">Pro Maky: V návrhu chybí hlavní téma projektu – záznam soli a energetických nápojů. Chybí i obrazovka s doporučením lékaře a průvodce měřením.</w:t>
+      </w:r>
+    </w:p>
+    <w:p>
+      <w:pPr>
+        <w:numPr>
+          <w:ilvl w:val="0"/>
+          <w:numId w:val="1"/>
+        </w:numPr>
+      </w:pPr>
+      <w:r>
+        <w:t xml:space="preserve">Pro Maky: Tlačítko „Smazat měření“ je v rozporu s tím, že se záznamy nemažou, jen opravují (s historií změn). Pacient by mohl smazat nanejvýš záznam, který ještě nebyl odeslaný na server.</w:t>
+      </w:r>
+    </w:p>
+    <w:p>
+      <w:pPr>
+        <w:numPr>
+          <w:ilvl w:val="0"/>
+          <w:numId w:val="1"/>
+        </w:numPr>
+      </w:pPr>
+      <w:r>
+        <w:t xml:space="preserve">Pro Maky: Volba „Pokračovat jako host“ se ke zdravotním datům a dvoufaktorovému přihlášení nehodí – navrhuji ji odstranit.</w:t>
+      </w:r>
+    </w:p>
+    <w:p>
+      <w:pPr>
+        <w:numPr>
+          <w:ilvl w:val="0"/>
+          <w:numId w:val="1"/>
+        </w:numPr>
+      </w:pPr>
+      <w:r>
+        <w:t xml:space="preserve">Pro Maky: Klasifikace hodnoty s doporučením („Doporučujeme pokračovat…“) se blíží diagnostice; podle nefunkčních požadavků (NFP-12) aplikace sama nic nedoporučuje – doporučení dává jen lékař. Navrhuji jen neutrální zobrazení vůči limitům.</w:t>
+      </w:r>
+    </w:p>
+    <w:p>
+      <w:pPr>
+        <w:numPr>
+          <w:ilvl w:val="0"/>
+          <w:numId w:val="1"/>
+        </w:numPr>
+      </w:pPr>
+      <w:r>
+        <w:t xml:space="preserve">Pro Maky: Obrazovka Připomínky je dobrá a splňuje požadavek FP-A13 👍</w:t>
       </w:r>
     </w:p>
     <w:sectPr>

</xml_diff>

<commit_message>
Vzkazy: program pristi schuzky
</commit_message>
<xml_diff>
--- a/Vzkazy.docx
+++ b/Vzkazy.docx
@@ -661,6 +661,103 @@
       </w:pPr>
       <w:r>
         <w:t xml:space="preserve">Pro Maky: Obrazovka Připomínky je dobrá a splňuje požadavek FP-A13 👍</w:t>
+      </w:r>
+    </w:p>
+    <w:p>
+      <w:r>
+        <w:rPr>
+          <w:b/>
+          <w:bCs/>
+        </w:rPr>
+        <w:t xml:space="preserve">Program příští schůzky (souhrn)</w:t>
+      </w:r>
+    </w:p>
+    <w:p>
+      <w:pPr>
+        <w:numPr>
+          <w:ilvl w:val="0"/>
+          <w:numId w:val="1"/>
+        </w:numPr>
+      </w:pPr>
+      <w:r>
+        <w:t xml:space="preserve">1. Role 4: kdo ji dělá (Domi, nebo rozdělení v týmu).</w:t>
+      </w:r>
+    </w:p>
+    <w:p>
+      <w:pPr>
+        <w:numPr>
+          <w:ilvl w:val="0"/>
+          <w:numId w:val="1"/>
+        </w:numPr>
+      </w:pPr>
+      <w:r>
+        <w:t xml:space="preserve">2. Prototyp, nebo jen dokumentace (zatím: jen dokumentace – ověřit na konzultaci).</w:t>
+      </w:r>
+    </w:p>
+    <w:p>
+      <w:pPr>
+        <w:numPr>
+          <w:ilvl w:val="0"/>
+          <w:numId w:val="1"/>
+        </w:numPr>
+      </w:pPr>
+      <w:r>
+        <w:t xml:space="preserve">3. Oprávnění pacienta k alertům (návrh: pacient alerty nevidí, jen výzvu v aplikaci).</w:t>
+      </w:r>
+    </w:p>
+    <w:p>
+      <w:pPr>
+        <w:numPr>
+          <w:ilvl w:val="0"/>
+          <w:numId w:val="1"/>
+        </w:numPr>
+      </w:pPr>
+      <w:r>
+        <w:t xml:space="preserve">4. Bezpečnost a GDPR, doba uchování dat (NFP-16).</w:t>
+      </w:r>
+    </w:p>
+    <w:p>
+      <w:pPr>
+        <w:numPr>
+          <w:ilvl w:val="0"/>
+          <w:numId w:val="1"/>
+        </w:numPr>
+      </w:pPr>
+      <w:r>
+        <w:t xml:space="preserve">5. Priority požadavků (MoSCoW), FP-I09 (souhrn životosprávy do NIS?), výběr person – spolecny/Pozadavky_spolecne.xlsx.</w:t>
+      </w:r>
+    </w:p>
+    <w:p>
+      <w:pPr>
+        <w:numPr>
+          <w:ilvl w:val="0"/>
+          <w:numId w:val="1"/>
+        </w:numPr>
+      </w:pPr>
+      <w:r>
+        <w:t xml:space="preserve">6. Testovací scénáře – odsouhlasit (5 min), Sabi/17_Testovani.docx.</w:t>
+      </w:r>
+    </w:p>
+    <w:p>
+      <w:pPr>
+        <w:numPr>
+          <w:ilvl w:val="0"/>
+          <w:numId w:val="1"/>
+        </w:numPr>
+      </w:pPr>
+      <w:r>
+        <w:t xml:space="preserve">7. GUI aplikace a portálu: jednotný styl a barevné indikátory podle limitů pacienta.</w:t>
+      </w:r>
+    </w:p>
+    <w:p>
+      <w:pPr>
+        <w:numPr>
+          <w:ilvl w:val="0"/>
+          <w:numId w:val="1"/>
+        </w:numPr>
+      </w:pPr>
+      <w:r>
+        <w:t xml:space="preserve">8. Component diagram: vede Ema, hotový do 11. 11. (před konzultací 12. 11.).</w:t>
       </w:r>
     </w:p>
     <w:sectPr>

</xml_diff>

<commit_message>
Role 4: popis integratoru a FHIR, otazky pro Emu a na konzultaci
</commit_message>
<xml_diff>
--- a/Vzkazy.docx
+++ b/Vzkazy.docx
@@ -758,6 +758,198 @@
       </w:pPr>
       <w:r>
         <w:t xml:space="preserve">8. Component diagram: vede Ema, hotový do 11. 11. (před konzultací 12. 11.).</w:t>
+      </w:r>
+    </w:p>
+    <w:p>
+      <w:r>
+        <w:rPr>
+          <w:b/>
+          <w:bCs/>
+        </w:rPr>
+        <w:t xml:space="preserve">Od Sabi (30. 10.) – roli 4 (integrátor NIS, Úvod, Nasazení) přebírám já</w:t>
+      </w:r>
+    </w:p>
+    <w:p>
+      <w:pPr>
+        <w:numPr>
+          <w:ilvl w:val="0"/>
+          <w:numId w:val="1"/>
+        </w:numPr>
+      </w:pPr>
+      <w:r>
+        <w:t xml:space="preserve">Výstupy role 4 dávám do složky Role4-S: use case diagram integrátoru, stavový diagram synchronizace s NIS a popis integrátoru s FHIR mapováním (25_Integrator_FHIR.docx). Výzva pro Domi výše tím padá.</w:t>
+      </w:r>
+    </w:p>
+    <w:p>
+      <w:r>
+        <w:rPr>
+          <w:b/>
+          <w:bCs/>
+        </w:rPr>
+        <w:t xml:space="preserve">Otázky pro Emu (role 3) – návaznost integrátoru na databázi</w:t>
+      </w:r>
+    </w:p>
+    <w:p>
+      <w:pPr>
+        <w:numPr>
+          <w:ilvl w:val="0"/>
+          <w:numId w:val="1"/>
+        </w:numPr>
+      </w:pPr>
+      <w:r>
+        <w:t xml:space="preserve">Může mít sloupec NisSynchronizace.stav hodnoty čeká / odesláno / chyba? Na nich stojí můj stavový diagram synchronizace.</w:t>
+      </w:r>
+    </w:p>
+    <w:p>
+      <w:pPr>
+        <w:numPr>
+          <w:ilvl w:val="0"/>
+          <w:numId w:val="1"/>
+        </w:numPr>
+      </w:pPr>
+      <w:r>
+        <w:t xml:space="preserve">Zapíše API při uložení nového měření i při opravě měření lékařem do NisSynchronizace záznam se stavem čeká? Integrátor si podle toho vybírá, co odeslat.</w:t>
+      </w:r>
+    </w:p>
+    <w:p>
+      <w:pPr>
+        <w:numPr>
+          <w:ilvl w:val="0"/>
+          <w:numId w:val="1"/>
+        </w:numPr>
+      </w:pPr>
+      <w:r>
+        <w:t xml:space="preserve">Integrátor potřebuje samostatný DB účet: jen čtení tabulek Pacient, Zarizeni, MereniTlaku (případně Aktivita) a čtení i zápis do NisSynchronizace. Sedí to tak s tvým návrhem?</w:t>
+      </w:r>
+    </w:p>
+    <w:p>
+      <w:pPr>
+        <w:numPr>
+          <w:ilvl w:val="0"/>
+          <w:numId w:val="1"/>
+        </w:numPr>
+      </w:pPr>
+      <w:r>
+        <w:t xml:space="preserve">Pacient.nis_identifikator používám jako identifikátor pacienta v NIS (FHIR Patient.identifier) – je to tak myšlené?</w:t>
+      </w:r>
+    </w:p>
+    <w:p>
+      <w:pPr>
+        <w:numPr>
+          <w:ilvl w:val="0"/>
+          <w:numId w:val="1"/>
+        </w:numPr>
+      </w:pPr>
+      <w:r>
+        <w:t xml:space="preserve">Do component diagramu: integrátor čte DB napřímo (ne přes API), do NIS posílá data přes HL7 FHIR (HTTPS) a e-maily administrátorovi přes SMTP.</w:t>
+      </w:r>
+    </w:p>
+    <w:p>
+      <w:r>
+        <w:rPr>
+          <w:b/>
+          <w:bCs/>
+        </w:rPr>
+        <w:t xml:space="preserve">Na co se zeptat na konzultaci 12. 11.</w:t>
+      </w:r>
+    </w:p>
+    <w:p>
+      <w:pPr>
+        <w:numPr>
+          <w:ilvl w:val="0"/>
+          <w:numId w:val="1"/>
+        </w:numPr>
+      </w:pPr>
+      <w:r>
+        <w:t xml:space="preserve">Informovat: roli 4 převzala Sabi (Domi se neozvala) – zohlednit ve výkazu práce.</w:t>
+      </w:r>
+    </w:p>
+    <w:p>
+      <w:pPr>
+        <w:numPr>
+          <w:ilvl w:val="0"/>
+          <w:numId w:val="1"/>
+        </w:numPr>
+      </w:pPr>
+      <w:r>
+        <w:t xml:space="preserve">Stačí jen návrhová dokumentace, nebo chtějí i funkční prototyp?</w:t>
+      </w:r>
+    </w:p>
+    <w:p>
+      <w:pPr>
+        <w:numPr>
+          <w:ilvl w:val="0"/>
+          <w:numId w:val="1"/>
+        </w:numPr>
+      </w:pPr>
+      <w:r>
+        <w:t xml:space="preserve">Je v pořádku zaměření na mladé dospělé (18–40) a vliv soli a energetických nápojů?</w:t>
+      </w:r>
+    </w:p>
+    <w:p>
+      <w:pPr>
+        <w:numPr>
+          <w:ilvl w:val="0"/>
+          <w:numId w:val="1"/>
+        </w:numPr>
+      </w:pPr>
+      <w:r>
+        <w:t xml:space="preserve">FHIR: stačí mapování dat na zdroje + ukázka JSON zprávy? Je verze FHIR R4 v pořádku?</w:t>
+      </w:r>
+    </w:p>
+    <w:p>
+      <w:pPr>
+        <w:numPr>
+          <w:ilvl w:val="0"/>
+          <w:numId w:val="1"/>
+        </w:numPr>
+      </w:pPr>
+      <w:r>
+        <w:t xml:space="preserve">Komunikace s NIS: stačí jen odesílání dat do NIS, nebo má integrátor data z NIS i načítat?</w:t>
+      </w:r>
+    </w:p>
+    <w:p>
+      <w:pPr>
+        <w:numPr>
+          <w:ilvl w:val="0"/>
+          <w:numId w:val="1"/>
+        </w:numPr>
+      </w:pPr>
+      <w:r>
+        <w:t xml:space="preserve">Posílat do NIS i souhrn aktivity a životosprávy (FP-I09), nebo jen měření tlaku a pulsu?</w:t>
+      </w:r>
+    </w:p>
+    <w:p>
+      <w:pPr>
+        <w:numPr>
+          <w:ilvl w:val="0"/>
+          <w:numId w:val="1"/>
+        </w:numPr>
+      </w:pPr>
+      <w:r>
+        <w:t xml:space="preserve">Můžeme navrhnout konkrétní reálný tlakoměr? Aktivita z telefonu, nebo z nositelného zařízení?</w:t>
+      </w:r>
+    </w:p>
+    <w:p>
+      <w:pPr>
+        <w:numPr>
+          <w:ilvl w:val="0"/>
+          <w:numId w:val="1"/>
+        </w:numPr>
+      </w:pPr>
+      <w:r>
+        <w:t xml:space="preserve">Je k dispozici šablona dokumentu a jaká citační norma (ISO 690)? Můžou velké diagramy do příloh?</w:t>
+      </w:r>
+    </w:p>
+    <w:p>
+      <w:pPr>
+        <w:numPr>
+          <w:ilvl w:val="0"/>
+          <w:numId w:val="1"/>
+        </w:numPr>
+      </w:pPr>
+      <w:r>
+        <w:t xml:space="preserve">Hodnocení: tým, nebo jednotlivci? Má výkaz práce v % vliv na známku? Prezentuje každý svou část?</w:t>
       </w:r>
     </w:p>
     <w:sectPr>

</xml_diff>

<commit_message>
Role 4: Uvod, vzkaz ke kontrole a dalsi kroky
</commit_message>
<xml_diff>
--- a/Vzkazy.docx
+++ b/Vzkazy.docx
@@ -950,6 +950,167 @@
       </w:pPr>
       <w:r>
         <w:t xml:space="preserve">Hodnocení: tým, nebo jednotlivci? Má výkaz práce v % vliv na známku? Prezentuje každý svou část?</w:t>
+      </w:r>
+    </w:p>
+    <w:p>
+      <w:r>
+        <w:rPr>
+          <w:b/>
+          <w:bCs/>
+        </w:rPr>
+        <w:t xml:space="preserve">Od Sabi (30. 10.) – návrh kapitoly Úvod (Role4-S/26_Uvod.docx)</w:t>
+      </w:r>
+    </w:p>
+    <w:p>
+      <w:pPr>
+        <w:numPr>
+          <w:ilvl w:val="0"/>
+          <w:numId w:val="1"/>
+        </w:numPr>
+      </w:pPr>
+      <w:r>
+        <w:t xml:space="preserve">Úvod je hotový jako návrh (~2,5 strany, 9 zdrojů): řešený problém (data EHES 2019 pro ČR), úvod do problematiky (domácí měření dle ESH 2023, sůl, energetické nápoje, pohyb), cíl a cílová skupina 18–40 let, přehled současných řešení se srovnávací tabulkou.</w:t>
+      </w:r>
+    </w:p>
+    <w:p>
+      <w:pPr>
+        <w:numPr>
+          <w:ilvl w:val="0"/>
+          <w:numId w:val="1"/>
+        </w:numPr>
+      </w:pPr>
+      <w:r>
+        <w:t xml:space="preserve">Všichni: prosím přečtěte Úvod do čtvrtka 5. 11. a připomínky napište sem do Vzkazů. Hlavně zkontrolujte, jestli cíl a cílová skupina sedí s tím, co máte ve svých blocích.</w:t>
+      </w:r>
+    </w:p>
+    <w:p>
+      <w:pPr>
+        <w:numPr>
+          <w:ilvl w:val="0"/>
+          <w:numId w:val="1"/>
+        </w:numPr>
+      </w:pPr>
+      <w:r>
+        <w:t xml:space="preserve">Maky: ve srovnávací tabulce jsou u „Náš systém“ uvedené funkce aplikace – BLE tlakoměr, rychlý záznam soli a energetických nápojů, kroky a doporučení lékaře v aplikaci. Pokud něco z toho v aplikaci mít nebudeš, dej vědět, upravím to.</w:t>
+      </w:r>
+    </w:p>
+    <w:p>
+      <w:pPr>
+        <w:numPr>
+          <w:ilvl w:val="0"/>
+          <w:numId w:val="1"/>
+        </w:numPr>
+      </w:pPr>
+      <w:r>
+        <w:t xml:space="preserve">Ema: v tabulce je uvedený přenos do NIS přes HL7 FHIR a alerty s eskalací – obojí stojí na tvém API a databázi.</w:t>
+      </w:r>
+    </w:p>
+    <w:p>
+      <w:pPr>
+        <w:numPr>
+          <w:ilvl w:val="0"/>
+          <w:numId w:val="1"/>
+        </w:numPr>
+      </w:pPr>
+      <w:r>
+        <w:t xml:space="preserve">Kontrola zdrojů před odevzdáním (udělám já, kdo má přístup přes školu, může pomoct): u zdrojů [4] Tucker 2017 (PLoS Medicine) a [7] Cornelissen a Smart 2013 (Journal of the American Heart Association) ověřit v originále ročník a číslo časopisu – výsledky jsou ověřené, bibliografické údaje uvedené zpaměti.</w:t>
+      </w:r>
+    </w:p>
+    <w:p>
+      <w:pPr>
+        <w:numPr>
+          <w:ilvl w:val="0"/>
+          <w:numId w:val="1"/>
+        </w:numPr>
+      </w:pPr>
+      <w:r>
+        <w:t xml:space="preserve">Řádek „Platformy telefonů“ (Apple Zdraví, Google Health Connect) ve srovnání nemá vlastní zdroj, je popsaný obecně – kdyby to vadilo, doplníme odkaz na oficiální stránky.</w:t>
+      </w:r>
+    </w:p>
+    <w:p>
+      <w:pPr>
+        <w:numPr>
+          <w:ilvl w:val="0"/>
+          <w:numId w:val="1"/>
+        </w:numPr>
+      </w:pPr>
+      <w:r>
+        <w:t xml:space="preserve">Indická studie [2] je v textu jen jako příklad, že mladí o hypertenzi vědí méně; česká čísla zvlášť pro mladé nejsou k dispozici.</w:t>
+      </w:r>
+    </w:p>
+    <w:p>
+      <w:r>
+        <w:rPr>
+          <w:b/>
+          <w:bCs/>
+        </w:rPr>
+        <w:t xml:space="preserve">Úvod – co ještě udělám já (Sabi)</w:t>
+      </w:r>
+    </w:p>
+    <w:p>
+      <w:pPr>
+        <w:numPr>
+          <w:ilvl w:val="0"/>
+          <w:numId w:val="1"/>
+        </w:numPr>
+      </w:pPr>
+      <w:r>
+        <w:t xml:space="preserve">Ověřit v originále ročník a číslo časopisu u zdrojů [4] Tucker 2017 a [7] Cornelissen a Smart 2013 (případně přes školní přístup).</w:t>
+      </w:r>
+    </w:p>
+    <w:p>
+      <w:pPr>
+        <w:numPr>
+          <w:ilvl w:val="0"/>
+          <w:numId w:val="1"/>
+        </w:numPr>
+      </w:pPr>
+      <w:r>
+        <w:t xml:space="preserve">Rozhodnout, jestli k „Platformám telefonů“ doplnit zdroj (oficiální stránky Apple Zdraví / Google Health Connect).</w:t>
+      </w:r>
+    </w:p>
+    <w:p>
+      <w:pPr>
+        <w:numPr>
+          <w:ilvl w:val="0"/>
+          <w:numId w:val="1"/>
+        </w:numPr>
+      </w:pPr>
+      <w:r>
+        <w:t xml:space="preserve">Po 5. 11. zapracovat vaše připomínky z Vzkazů.</w:t>
+      </w:r>
+    </w:p>
+    <w:p>
+      <w:pPr>
+        <w:numPr>
+          <w:ilvl w:val="0"/>
+          <w:numId w:val="1"/>
+        </w:numPr>
+      </w:pPr>
+      <w:r>
+        <w:t xml:space="preserve">Na konzultaci 12. 11. ověřit citační normu (ISO 690) a že je zaměření na mladé dospělé a životosprávu v pořádku; podle odpovědi Úvod případně upravit.</w:t>
+      </w:r>
+    </w:p>
+    <w:p>
+      <w:pPr>
+        <w:numPr>
+          <w:ilvl w:val="0"/>
+          <w:numId w:val="1"/>
+        </w:numPr>
+      </w:pPr>
+      <w:r>
+        <w:t xml:space="preserve">Vložit Úvod do společného dokumentu na OneDrive a doplnit čísla tabulky a zdrojů podle číslování celého dokumentu.</w:t>
+      </w:r>
+    </w:p>
+    <w:p>
+      <w:pPr>
+        <w:numPr>
+          <w:ilvl w:val="0"/>
+          <w:numId w:val="1"/>
+        </w:numPr>
+      </w:pPr>
+      <w:r>
+        <w:t xml:space="preserve">Pak označit úkol #26 v Rozdeleni_projektu_SI2.xlsx jako Hotovo.</w:t>
       </w:r>
     </w:p>
     <w:sectPr>

</xml_diff>

<commit_message>
Spolecne: Bezpecnost a GDPR, vzkaz ke kontrole
</commit_message>
<xml_diff>
--- a/Vzkazy.docx
+++ b/Vzkazy.docx
@@ -1111,6 +1111,92 @@
       </w:pPr>
       <w:r>
         <w:t xml:space="preserve">Pak označit úkol #26 v Rozdeleni_projektu_SI2.xlsx jako Hotovo.</w:t>
+      </w:r>
+    </w:p>
+    <w:p>
+      <w:r>
+        <w:rPr>
+          <w:b/>
+          <w:bCs/>
+        </w:rPr>
+        <w:t xml:space="preserve">Od Sabi (30. 10.) – podkapitola Bezpečnost a GDPR (spolecny/06_Bezpecnost_GDPR.docx)</w:t>
+      </w:r>
+    </w:p>
+    <w:p>
+      <w:pPr>
+        <w:numPr>
+          <w:ilvl w:val="0"/>
+          <w:numId w:val="1"/>
+        </w:numPr>
+      </w:pPr>
+      <w:r>
+        <w:t xml:space="preserve">Napsala jsem návrh společné podkapitoly #6: přihlášení a oprávnění, šifrování, audit, GDPR a tabulka bezpečnostních opatření po částech systému. Vychází z Implementace Emy, nefunkčních požadavků Maky a mých kapitol k portálu a integrátoru.</w:t>
+      </w:r>
+    </w:p>
+    <w:p>
+      <w:pPr>
+        <w:numPr>
+          <w:ilvl w:val="0"/>
+          <w:numId w:val="1"/>
+        </w:numPr>
+      </w:pPr>
+      <w:r>
+        <w:t xml:space="preserve">Všichni: prosím přečtěte do čtvrtka 5. 11. a připomínky napište sem. Hlavně zkontrolujte řádek své části v tabulce „Zabezpečení podle částí systému“.</w:t>
+      </w:r>
+    </w:p>
+    <w:p>
+      <w:pPr>
+        <w:numPr>
+          <w:ilvl w:val="0"/>
+          <w:numId w:val="1"/>
+        </w:numPr>
+      </w:pPr>
+      <w:r>
+        <w:t xml:space="preserve">Maky: v tabulce je pro aplikaci uvedeno šifrování lokálně uložených dat a tokeny v zabezpečeném úložišti telefonu – sedí to s tvým návrhem?</w:t>
+      </w:r>
+    </w:p>
+    <w:p>
+      <w:pPr>
+        <w:numPr>
+          <w:ilvl w:val="0"/>
+          <w:numId w:val="1"/>
+        </w:numPr>
+      </w:pPr>
+      <w:r>
+        <w:t xml:space="preserve">Ema: podkapitola přebírá tvé řešení (OAuth 2.0 / OpenID Connect, TOTP, Argon2id, šifrované zálohy) – zkontroluj prosím, že je popsané správně.</w:t>
+      </w:r>
+    </w:p>
+    <w:p>
+      <w:pPr>
+        <w:numPr>
+          <w:ilvl w:val="0"/>
+          <w:numId w:val="1"/>
+        </w:numPr>
+      </w:pPr>
+      <w:r>
+        <w:t xml:space="preserve">Všichni: ve svém bloku stačí jedna věta s odkazem, např. „Zabezpečení komunikace a údajů viz kapitola Bezpečnost a ochrana osobních údajů.“</w:t>
+      </w:r>
+    </w:p>
+    <w:p>
+      <w:pPr>
+        <w:numPr>
+          <w:ilvl w:val="0"/>
+          <w:numId w:val="1"/>
+        </w:numPr>
+      </w:pPr>
+      <w:r>
+        <w:t xml:space="preserve">Na schůzce: rozhodnout dobu uchování dat (NFP-16).</w:t>
+      </w:r>
+    </w:p>
+    <w:p>
+      <w:pPr>
+        <w:numPr>
+          <w:ilvl w:val="0"/>
+          <w:numId w:val="1"/>
+        </w:numPr>
+      </w:pPr>
+      <w:r>
+        <w:t xml:space="preserve">Co ještě udělám já (Sabi): po 5. 11. zapracuji připomínky, doplním dobu uchování dat podle rozhodnutí ze schůzky, vložím podkapitolu do společného dokumentu na OneDrive a označím úkol #6 jako Hotovo.</w:t>
       </w:r>
     </w:p>
     <w:sectPr>

</xml_diff>

<commit_message>
Role 4: Nasazeni, diagram nasazeni, vzkaz pro Emu a Maky
</commit_message>
<xml_diff>
--- a/Vzkazy.docx
+++ b/Vzkazy.docx
@@ -1197,6 +1197,70 @@
       </w:pPr>
       <w:r>
         <w:t xml:space="preserve">Co ještě udělám já (Sabi): po 5. 11. zapracuji připomínky, doplním dobu uchování dat podle rozhodnutí ze schůzky, vložím podkapitolu do společného dokumentu na OneDrive a označím úkol #6 jako Hotovo.</w:t>
+      </w:r>
+    </w:p>
+    <w:p>
+      <w:r>
+        <w:rPr>
+          <w:b/>
+          <w:bCs/>
+        </w:rPr>
+        <w:t xml:space="preserve">Od Sabi (30. 10.) – kapitola Nasazení a diagram nasazení (Role4-S/27_Nasazeni.docx, Role4-S/Deployment_diagram.drawio)</w:t>
+      </w:r>
+    </w:p>
+    <w:p>
+      <w:pPr>
+        <w:numPr>
+          <w:ilvl w:val="0"/>
+          <w:numId w:val="1"/>
+        </w:numPr>
+      </w:pPr>
+      <w:r>
+        <w:t xml:space="preserve">Napsala jsem návrh kapitoly Nasazení: popis nasazení (servery v ČR/EU, kontejnery Docker, tři prostředí), postup prvního nasazení, nasazování dalších verzí přes GitHub Actions a tabulku požadavků na prostředí. K tomu diagram nasazení.</w:t>
+      </w:r>
+    </w:p>
+    <w:p>
+      <w:pPr>
+        <w:numPr>
+          <w:ilvl w:val="0"/>
+          <w:numId w:val="1"/>
+        </w:numPr>
+      </w:pPr>
+      <w:r>
+        <w:t xml:space="preserve">Ema: prosím ověř do čtvrtka 5. 11., že kapitola sedí s tvou Implementací – Linux + Docker, PostgreSQL na samostatném serveru, WEB API, poskytovatel identit (uvedla jsem příklad Keycloak – pokud chceš jiný, napiš), nasazování přes GitHub Actions, řízené migrace DB. Zkontroluj i odhad parametrů serverů v tabulce požadavků.</w:t>
+      </w:r>
+    </w:p>
+    <w:p>
+      <w:pPr>
+        <w:numPr>
+          <w:ilvl w:val="0"/>
+          <w:numId w:val="1"/>
+        </w:numPr>
+      </w:pPr>
+      <w:r>
+        <w:t xml:space="preserve">Ema: diagram nasazení můžeš použít i jako podklad ke component diagramu – jsou v něm všechny části systému a jejich propojení.</w:t>
+      </w:r>
+    </w:p>
+    <w:p>
+      <w:pPr>
+        <w:numPr>
+          <w:ilvl w:val="0"/>
+          <w:numId w:val="1"/>
+        </w:numPr>
+      </w:pPr>
+      <w:r>
+        <w:t xml:space="preserve">Maky: v tabulce požadavků je pro telefon „aktuálně podporovaná verze Androidu nebo iOS, Bluetooth Low Energy“ a distribuce aplikace přes App Store a Google Play – sedí to s tvou kapitolou Údržba?</w:t>
+      </w:r>
+    </w:p>
+    <w:p>
+      <w:pPr>
+        <w:numPr>
+          <w:ilvl w:val="0"/>
+          <w:numId w:val="1"/>
+        </w:numPr>
+      </w:pPr>
+      <w:r>
+        <w:t xml:space="preserve">Co ještě udělám já (Sabi): vyexportuji PNG diagramu nasazení, po 5. 11. zapracuji připomínky, vložím kapitolu do společného dokumentu na OneDrive a označím úkol #27 jako Hotovo.</w:t>
       </w:r>
     </w:p>
     <w:sectPr>

</xml_diff>

<commit_message>
Spolecne: akteri a rozhrani, vzkaz k odsouhlaseni
</commit_message>
<xml_diff>
--- a/Vzkazy.docx
+++ b/Vzkazy.docx
@@ -1261,6 +1261,70 @@
       </w:pPr>
       <w:r>
         <w:t xml:space="preserve">Co ještě udělám já (Sabi): vyexportuji PNG diagramu nasazení, po 5. 11. zapracuji připomínky, vložím kapitolu do společného dokumentu na OneDrive a označím úkol #27 jako Hotovo.</w:t>
+      </w:r>
+    </w:p>
+    <w:p>
+      <w:r>
+        <w:rPr>
+          <w:b/>
+          <w:bCs/>
+        </w:rPr>
+        <w:t xml:space="preserve">Od Sabi (30. 10.) – aktéři a rozhraní mezi částmi systému (spolecny/03_Akteri_a_rozhrani.docx)</w:t>
+      </w:r>
+    </w:p>
+    <w:p>
+      <w:pPr>
+        <w:numPr>
+          <w:ilvl w:val="0"/>
+          <w:numId w:val="1"/>
+        </w:numPr>
+      </w:pPr>
+      <w:r>
+        <w:t xml:space="preserve">Připravila jsem společný úkol #3: seznam aktérů (kdo to je a co od systému chce), matici aktér × část systému a tabulku 10 rozhraní mezi částmi – u každého jsou předávaná data, protokol a kde je rozhraní dohodnuté.</w:t>
+      </w:r>
+    </w:p>
+    <w:p>
+      <w:pPr>
+        <w:numPr>
+          <w:ilvl w:val="0"/>
+          <w:numId w:val="1"/>
+        </w:numPr>
+      </w:pPr>
+      <w:r>
+        <w:t xml:space="preserve">Všichni: prosím zkontrolujte do čtvrtka 5. 11. řádky, které se týkají vašeho bloku, a napište sem, jestli sedí. Hodí se to i na konzultaci 12. 11. jako přehled, jak bloky do sebe zapadají.</w:t>
+      </w:r>
+    </w:p>
+    <w:p>
+      <w:pPr>
+        <w:numPr>
+          <w:ilvl w:val="0"/>
+          <w:numId w:val="1"/>
+        </w:numPr>
+      </w:pPr>
+      <w:r>
+        <w:t xml:space="preserve">Maky: rozhraní tlakoměr → aplikace a aplikace → API; v JSON s měřením zatím chybí ID tlakoměru a příznak nepravidelného rytmu.</w:t>
+      </w:r>
+    </w:p>
+    <w:p>
+      <w:pPr>
+        <w:numPr>
+          <w:ilvl w:val="0"/>
+          <w:numId w:val="1"/>
+        </w:numPr>
+      </w:pPr>
+      <w:r>
+        <w:t xml:space="preserve">Ema: rozhraní aplikace → API, portál ↔ API, API ↔ databáze a integrátor ↔ databáze (to čeká na tvé potvrzení – viz otázky výše).</w:t>
+      </w:r>
+    </w:p>
+    <w:p>
+      <w:pPr>
+        <w:numPr>
+          <w:ilvl w:val="0"/>
+          <w:numId w:val="1"/>
+        </w:numPr>
+      </w:pPr>
+      <w:r>
+        <w:t xml:space="preserve">Co ještě udělám já (Sabi): po 5. 11. zapracuji připomínky, vložím tabulky do společného dokumentu (kapitola Požadavky / Design architektury) a označím úkol #3 jako Hotovo.</w:t>
       </w:r>
     </w:p>
     <w:sectPr>

</xml_diff>

<commit_message>
Spolecne: navrh kapitoly Analyza pozadavku
</commit_message>
<xml_diff>
--- a/Vzkazy.docx
+++ b/Vzkazy.docx
@@ -1325,6 +1325,59 @@
       </w:pPr>
       <w:r>
         <w:t xml:space="preserve">Co ještě udělám já (Sabi): po 5. 11. zapracuji připomínky, vložím tabulky do společného dokumentu (kapitola Požadavky / Design architektury) a označím úkol #3 jako Hotovo.</w:t>
+      </w:r>
+    </w:p>
+    <w:p>
+      <w:r>
+        <w:rPr>
+          <w:b/>
+          <w:bCs/>
+        </w:rPr>
+        <w:t xml:space="preserve">Od Sabi (30. 10.) – kapitola Analýza požadavků (spolecny/02_Analyza_pozadavku.docx)</w:t>
+      </w:r>
+    </w:p>
+    <w:p>
+      <w:pPr>
+        <w:numPr>
+          <w:ilvl w:val="0"/>
+          <w:numId w:val="1"/>
+        </w:numPr>
+      </w:pPr>
+      <w:r>
+        <w:t xml:space="preserve">Napsala jsem návrh kapitoly: zdroje požadavků, cílová skupina, tři persony (Tomáš 22 let – student, Petra 34 let – IT konzultantka, MUDr. Eva Malá – praktická lékařka; jména sedí s návrhem GUI portálu), vysvětlení priorit MoSCoW, přehled počtu požadavků, hlavní funkční a nefunkční požadavky a příloha A s úplným seznamem.</w:t>
+      </w:r>
+    </w:p>
+    <w:p>
+      <w:pPr>
+        <w:numPr>
+          <w:ilvl w:val="0"/>
+          <w:numId w:val="1"/>
+        </w:numPr>
+      </w:pPr>
+      <w:r>
+        <w:t xml:space="preserve">Všichni: příloha A je vygenerovaná z tabulky spolecny/Pozadavky_spolecne.xlsx – proto je důležité, abyste do neděle 1. 11. odsouhlasily řádky svého bloku (sloupec Stav). Po odsouhlasení přílohu přegeneruji.</w:t>
+      </w:r>
+    </w:p>
+    <w:p>
+      <w:pPr>
+        <w:numPr>
+          <w:ilvl w:val="0"/>
+          <w:numId w:val="1"/>
+        </w:numPr>
+      </w:pPr>
+      <w:r>
+        <w:t xml:space="preserve">Všichni: prosím zkontrolujte do 5. 11. persony a odstavec „Hlavní funkční požadavky“ za svůj blok.</w:t>
+      </w:r>
+    </w:p>
+    <w:p>
+      <w:pPr>
+        <w:numPr>
+          <w:ilvl w:val="0"/>
+          <w:numId w:val="1"/>
+        </w:numPr>
+      </w:pPr>
+      <w:r>
+        <w:t xml:space="preserve">Co ještě udělám já (Sabi): po 1. 11. přegeneruji přílohu A podle odsouhlasené tabulky, po 5. 11. zapracuji připomínky, vložím kapitolu do společného dokumentu na OneDrive a označím úkol #2 jako Hotovo.</w:t>
       </w:r>
     </w:p>
     <w:sectPr>

</xml_diff>

<commit_message>
Spolecne: navrh Zhodnoceni, PNG diagramu nasazeni
</commit_message>
<xml_diff>
--- a/Vzkazy.docx
+++ b/Vzkazy.docx
@@ -1378,6 +1378,48 @@
       </w:pPr>
       <w:r>
         <w:t xml:space="preserve">Co ještě udělám já (Sabi): po 1. 11. přegeneruji přílohu A podle odsouhlasené tabulky, po 5. 11. zapracuji připomínky, vložím kapitolu do společného dokumentu na OneDrive a označím úkol #2 jako Hotovo.</w:t>
+      </w:r>
+    </w:p>
+    <w:p>
+      <w:r>
+        <w:rPr>
+          <w:b/>
+          <w:bCs/>
+        </w:rPr>
+        <w:t xml:space="preserve">Od Sabi (30. 10.) – kapitola Zhodnocení systému (spolecny/28_Zhodnoceni.docx)</w:t>
+      </w:r>
+    </w:p>
+    <w:p>
+      <w:pPr>
+        <w:numPr>
+          <w:ilvl w:val="0"/>
+          <w:numId w:val="1"/>
+        </w:numPr>
+      </w:pPr>
+      <w:r>
+        <w:t xml:space="preserve">Napsala jsem návrh společné kapitoly #28: shrnutí systému, výhody oproti současným řešením (navazuje na srovnání v Úvodu), omezení, možná rozšíření a závěr.</w:t>
+      </w:r>
+    </w:p>
+    <w:p>
+      <w:pPr>
+        <w:numPr>
+          <w:ilvl w:val="0"/>
+          <w:numId w:val="1"/>
+        </w:numPr>
+      </w:pPr>
+      <w:r>
+        <w:t xml:space="preserve">Všichni: prosím přečtěte do čtvrtka 5. 11. a napište sem, jestli s výhodami a omezeními souhlasíte nebo co doplnit za svůj blok.</w:t>
+      </w:r>
+    </w:p>
+    <w:p>
+      <w:pPr>
+        <w:numPr>
+          <w:ilvl w:val="0"/>
+          <w:numId w:val="1"/>
+        </w:numPr>
+      </w:pPr>
+      <w:r>
+        <w:t xml:space="preserve">Co ještě udělám já (Sabi): po 5. 11. zapracuji připomínky, po konzultaci 12. 11. kapitolu doladím podle toho, co řeknou cvičící, vložím ji do společného dokumentu a označím úkol #28 jako Hotovo.</w:t>
       </w:r>
     </w:p>
     <w:sectPr>

</xml_diff>